<commit_message>
Diplom ishini boyitish: I-bobga 7 ta rasm, oq fonli grafiklar, 2.3-jadval, radar chart, xatolar tuzatildi
- I-bobga 7 ta yangi rasm qo'shildi (kriptografiya tasnifi, Merkle-Damgard,
  Sponge, Davies-Meyer, NIST LWC timeline, IoT arxitekturasi, evolyutsiya)
- Dark tema skrinshotlari oq fonli grafiklar bilan almashtirildi (4 ta)
- 2.3-jadval (dastur modullari tuzilishi) qo'shildi
- Radar diagramma (2.9-rasm) qo'shildi
- Tipografik xatolar tuzatildi (rasim -> rasm)
- Jami: 16 rasm, 12 jadval

Co-authored-by: Abboskhon Akhmadkhujaev <66966708+Ahmadkhojaev@users.noreply.github.com>
</commit_message>
<xml_diff>
--- a/Abbos diplom ishi (6) - toldirilgan.docx
+++ b/Abbos diplom ishi (6) - toldirilgan.docx
@@ -22818,6 +22818,57 @@
     </w:p>
     <w:p>
       <w:pPr>
+        <w:jc w:val="center"/>
+      </w:pPr>
+      <w:r>
+        <w:drawing>
+          <wp:inline xmlns:a="http://schemas.openxmlformats.org/drawingml/2006/main" xmlns:pic="http://schemas.openxmlformats.org/drawingml/2006/picture">
+            <wp:extent cx="5029200" cy="3251200"/>
+            <wp:docPr id="14" name="Picture 14"/>
+            <wp:cNvGraphicFramePr>
+              <a:graphicFrameLocks noChangeAspect="1"/>
+            </wp:cNvGraphicFramePr>
+            <a:graphic>
+              <a:graphicData uri="http://schemas.openxmlformats.org/drawingml/2006/picture">
+                <pic:pic>
+                  <pic:nvPicPr>
+                    <pic:cNvPr id="0" name="1_1_tasnif.png"/>
+                    <pic:cNvPicPr/>
+                  </pic:nvPicPr>
+                  <pic:blipFill>
+                    <a:blip r:embed="rId18"/>
+                    <a:stretch>
+                      <a:fillRect/>
+                    </a:stretch>
+                  </pic:blipFill>
+                  <pic:spPr>
+                    <a:xfrm>
+                      <a:off x="0" y="0"/>
+                      <a:ext cx="5029200" cy="3251200"/>
+                    </a:xfrm>
+                    <a:prstGeom prst="rect"/>
+                  </pic:spPr>
+                </pic:pic>
+              </a:graphicData>
+            </a:graphic>
+          </wp:inline>
+        </w:drawing>
+      </w:r>
+    </w:p>
+    <w:p>
+      <w:pPr>
+        <w:jc w:val="center"/>
+      </w:pPr>
+      <w:r>
+        <w:rPr>
+          <w:i/>
+          <w:sz w:val="20"/>
+        </w:rPr>
+        <w:t>1.1-rasm: Kriptografik himoyalash usullarining tasnifi</w:t>
+      </w:r>
+    </w:p>
+    <w:p>
+      <w:pPr>
         <w:spacing w:line="360" w:lineRule="auto" w:after="0"/>
         <w:ind w:firstLine="709"/>
         <w:jc w:val="both"/>
@@ -24081,6 +24132,57 @@
     </w:p>
     <w:p>
       <w:pPr>
+        <w:jc w:val="center"/>
+      </w:pPr>
+      <w:r>
+        <w:drawing>
+          <wp:inline xmlns:a="http://schemas.openxmlformats.org/drawingml/2006/main" xmlns:pic="http://schemas.openxmlformats.org/drawingml/2006/picture">
+            <wp:extent cx="5029200" cy="2257757"/>
+            <wp:docPr id="16" name="Picture 16"/>
+            <wp:cNvGraphicFramePr>
+              <a:graphicFrameLocks noChangeAspect="1"/>
+            </wp:cNvGraphicFramePr>
+            <a:graphic>
+              <a:graphicData uri="http://schemas.openxmlformats.org/drawingml/2006/picture">
+                <pic:pic>
+                  <pic:nvPicPr>
+                    <pic:cNvPr id="0" name="1_3_sponge.png"/>
+                    <pic:cNvPicPr/>
+                  </pic:nvPicPr>
+                  <pic:blipFill>
+                    <a:blip r:embed="rId20"/>
+                    <a:stretch>
+                      <a:fillRect/>
+                    </a:stretch>
+                  </pic:blipFill>
+                  <pic:spPr>
+                    <a:xfrm>
+                      <a:off x="0" y="0"/>
+                      <a:ext cx="5029200" cy="2257757"/>
+                    </a:xfrm>
+                    <a:prstGeom prst="rect"/>
+                  </pic:spPr>
+                </pic:pic>
+              </a:graphicData>
+            </a:graphic>
+          </wp:inline>
+        </w:drawing>
+      </w:r>
+    </w:p>
+    <w:p>
+      <w:pPr>
+        <w:jc w:val="center"/>
+      </w:pPr>
+      <w:r>
+        <w:rPr>
+          <w:i/>
+          <w:sz w:val="20"/>
+        </w:rPr>
+        <w:t>1.3-rasm: Sponge konstruksiyasining ishlash prinsipi</w:t>
+      </w:r>
+    </w:p>
+    <w:p>
+      <w:pPr>
         <w:spacing w:after="0" w:line="360" w:lineRule="auto"/>
         <w:ind w:firstLine="708"/>
         <w:jc w:val="both"/>
@@ -25926,6 +26028,57 @@
           <w:lang w:val="en-US" w:eastAsia="ru-RU"/>
         </w:rPr>
         <w:t>Bu tasnif va tavsiflar kriptografiya sohasidagi zamonaviy yondashuvlarni qamrab oladi. Har bir funksiyaning o‘z afzalliklari va cheklovlari bor, ularni tanlashda xavfsizlik talablari, resurslar va ilova turini hisobga olish kerak. Batafsil tadqiqotlar va standartlar (FIPS 180, FIPS 202, ISO 29192) ga murojaat qilish tavsiya etiladi.</w:t>
+      </w:r>
+    </w:p>
+    <w:p>
+      <w:pPr>
+        <w:jc w:val="center"/>
+      </w:pPr>
+      <w:r>
+        <w:drawing>
+          <wp:inline xmlns:a="http://schemas.openxmlformats.org/drawingml/2006/main" xmlns:pic="http://schemas.openxmlformats.org/drawingml/2006/picture">
+            <wp:extent cx="5029200" cy="1568741"/>
+            <wp:docPr id="20" name="Picture 20"/>
+            <wp:cNvGraphicFramePr>
+              <a:graphicFrameLocks noChangeAspect="1"/>
+            </wp:cNvGraphicFramePr>
+            <a:graphic>
+              <a:graphicData uri="http://schemas.openxmlformats.org/drawingml/2006/picture">
+                <pic:pic>
+                  <pic:nvPicPr>
+                    <pic:cNvPr id="0" name="1_7_evolution.png"/>
+                    <pic:cNvPicPr/>
+                  </pic:nvPicPr>
+                  <pic:blipFill>
+                    <a:blip r:embed="rId24"/>
+                    <a:stretch>
+                      <a:fillRect/>
+                    </a:stretch>
+                  </pic:blipFill>
+                  <pic:spPr>
+                    <a:xfrm>
+                      <a:off x="0" y="0"/>
+                      <a:ext cx="5029200" cy="1568741"/>
+                    </a:xfrm>
+                    <a:prstGeom prst="rect"/>
+                  </pic:spPr>
+                </pic:pic>
+              </a:graphicData>
+            </a:graphic>
+          </wp:inline>
+        </w:drawing>
+      </w:r>
+    </w:p>
+    <w:p>
+      <w:pPr>
+        <w:jc w:val="center"/>
+      </w:pPr>
+      <w:r>
+        <w:rPr>
+          <w:i/>
+          <w:sz w:val="20"/>
+        </w:rPr>
+        <w:t>1.7-rasm: Kriptografik xesh funksiyalarning rivojlanish evolyutsiyasi</w:t>
       </w:r>
     </w:p>
     <w:p>
@@ -26598,6 +26751,57 @@
           <w:sz w:val="28"/>
         </w:rPr>
         <w:t>Har uchala tuzilmada oxirgi XOR (feed-forward) amali shifrni qaytarib bo‘lmaydigan (bir tomonlama) siqish funksiyasiga aylantiradi: shifr teskari hisoblanadigan bo‘lsa-da, feed-forward tufayli H_{i-1} ni H_i dan tiklab bo‘lmaydi. Davies-Meyer tuzilmasida har bir xabar bloki kalit jadvali (key schedule) orqali o‘tgani uchun, kalit jadvali sust bo‘lgan shifrlarda zaif kalitlar (fixed points) yuzaga kelishi mumkin. Miyaguchi-Preneel esa qo‘shimcha XOR hisobiga differensial kriptotahlilga eng yuqori bardoshlilik beradi, shu sababli Whirlpool kabi funksiyalarda qo‘llanilgan. Yengil vaznli muhitda bu tuzilmalarning afzalligi — agar qurilmada shifrlash uchun blokli shifr allaqachon mavjud bo‘lsa, xesh funksiyasini amalga oshirish uchun qo‘shimcha apparat (GE) deyarli talab etilmaydi (kod va sxema qayta ishlatiladi) [3, 4].</w:t>
+      </w:r>
+    </w:p>
+    <w:p>
+      <w:pPr>
+        <w:jc w:val="center"/>
+      </w:pPr>
+      <w:r>
+        <w:drawing>
+          <wp:inline xmlns:a="http://schemas.openxmlformats.org/drawingml/2006/main" xmlns:pic="http://schemas.openxmlformats.org/drawingml/2006/picture">
+            <wp:extent cx="5029200" cy="1755289"/>
+            <wp:docPr id="17" name="Picture 17"/>
+            <wp:cNvGraphicFramePr>
+              <a:graphicFrameLocks noChangeAspect="1"/>
+            </wp:cNvGraphicFramePr>
+            <a:graphic>
+              <a:graphicData uri="http://schemas.openxmlformats.org/drawingml/2006/picture">
+                <pic:pic>
+                  <pic:nvPicPr>
+                    <pic:cNvPr id="0" name="1_4_davies_meyer.png"/>
+                    <pic:cNvPicPr/>
+                  </pic:nvPicPr>
+                  <pic:blipFill>
+                    <a:blip r:embed="rId21"/>
+                    <a:stretch>
+                      <a:fillRect/>
+                    </a:stretch>
+                  </pic:blipFill>
+                  <pic:spPr>
+                    <a:xfrm>
+                      <a:off x="0" y="0"/>
+                      <a:ext cx="5029200" cy="1755289"/>
+                    </a:xfrm>
+                    <a:prstGeom prst="rect"/>
+                  </pic:spPr>
+                </pic:pic>
+              </a:graphicData>
+            </a:graphic>
+          </wp:inline>
+        </w:drawing>
+      </w:r>
+    </w:p>
+    <w:p>
+      <w:pPr>
+        <w:jc w:val="center"/>
+      </w:pPr>
+      <w:r>
+        <w:rPr>
+          <w:i/>
+          <w:sz w:val="20"/>
+        </w:rPr>
+        <w:t>1.4-rasm: Blok shifrga asoslangan xesh konstruksiyalari</w:t>
       </w:r>
     </w:p>
     <w:p>
@@ -31565,6 +31769,57 @@
     </w:p>
     <w:p>
       <w:pPr>
+        <w:jc w:val="center"/>
+      </w:pPr>
+      <w:r>
+        <w:drawing>
+          <wp:inline xmlns:a="http://schemas.openxmlformats.org/drawingml/2006/main" xmlns:pic="http://schemas.openxmlformats.org/drawingml/2006/picture">
+            <wp:extent cx="5029200" cy="1974552"/>
+            <wp:docPr id="15" name="Picture 15"/>
+            <wp:cNvGraphicFramePr>
+              <a:graphicFrameLocks noChangeAspect="1"/>
+            </wp:cNvGraphicFramePr>
+            <a:graphic>
+              <a:graphicData uri="http://schemas.openxmlformats.org/drawingml/2006/picture">
+                <pic:pic>
+                  <pic:nvPicPr>
+                    <pic:cNvPr id="0" name="1_2_merkle_damgard.png"/>
+                    <pic:cNvPicPr/>
+                  </pic:nvPicPr>
+                  <pic:blipFill>
+                    <a:blip r:embed="rId19"/>
+                    <a:stretch>
+                      <a:fillRect/>
+                    </a:stretch>
+                  </pic:blipFill>
+                  <pic:spPr>
+                    <a:xfrm>
+                      <a:off x="0" y="0"/>
+                      <a:ext cx="5029200" cy="1974552"/>
+                    </a:xfrm>
+                    <a:prstGeom prst="rect"/>
+                  </pic:spPr>
+                </pic:pic>
+              </a:graphicData>
+            </a:graphic>
+          </wp:inline>
+        </w:drawing>
+      </w:r>
+    </w:p>
+    <w:p>
+      <w:pPr>
+        <w:jc w:val="center"/>
+      </w:pPr>
+      <w:r>
+        <w:rPr>
+          <w:i/>
+          <w:sz w:val="20"/>
+        </w:rPr>
+        <w:t>1.2-rasm: Merkle-Damgård konstruksiyasining ishlash sxemasi</w:t>
+      </w:r>
+    </w:p>
+    <w:p>
+      <w:pPr>
         <w:pStyle w:val="5"/>
         <w:spacing w:before="0" w:line="360" w:lineRule="auto"/>
         <w:ind w:firstLine="708"/>
@@ -32231,6 +32486,57 @@
     </w:p>
     <w:p>
       <w:pPr>
+        <w:jc w:val="center"/>
+      </w:pPr>
+      <w:r>
+        <w:drawing>
+          <wp:inline xmlns:a="http://schemas.openxmlformats.org/drawingml/2006/main" xmlns:pic="http://schemas.openxmlformats.org/drawingml/2006/picture">
+            <wp:extent cx="5029200" cy="2491530"/>
+            <wp:docPr id="19" name="Picture 19"/>
+            <wp:cNvGraphicFramePr>
+              <a:graphicFrameLocks noChangeAspect="1"/>
+            </wp:cNvGraphicFramePr>
+            <a:graphic>
+              <a:graphicData uri="http://schemas.openxmlformats.org/drawingml/2006/picture">
+                <pic:pic>
+                  <pic:nvPicPr>
+                    <pic:cNvPr id="0" name="1_6_iot.png"/>
+                    <pic:cNvPicPr/>
+                  </pic:nvPicPr>
+                  <pic:blipFill>
+                    <a:blip r:embed="rId23"/>
+                    <a:stretch>
+                      <a:fillRect/>
+                    </a:stretch>
+                  </pic:blipFill>
+                  <pic:spPr>
+                    <a:xfrm>
+                      <a:off x="0" y="0"/>
+                      <a:ext cx="5029200" cy="2491530"/>
+                    </a:xfrm>
+                    <a:prstGeom prst="rect"/>
+                  </pic:spPr>
+                </pic:pic>
+              </a:graphicData>
+            </a:graphic>
+          </wp:inline>
+        </w:drawing>
+      </w:r>
+    </w:p>
+    <w:p>
+      <w:pPr>
+        <w:jc w:val="center"/>
+      </w:pPr>
+      <w:r>
+        <w:rPr>
+          <w:i/>
+          <w:sz w:val="20"/>
+        </w:rPr>
+        <w:t>1.6-rasm: IoT arxitekturasida xesh funksiyalarning qo'llanilish joylari</w:t>
+      </w:r>
+    </w:p>
+    <w:p>
+      <w:pPr>
         <w:pStyle w:val="4"/>
         <w:spacing w:before="0" w:line="360" w:lineRule="auto"/>
         <w:ind w:firstLine="708"/>
@@ -33829,6 +34135,57 @@
     </w:p>
     <w:p>
       <w:pPr>
+        <w:jc w:val="center"/>
+      </w:pPr>
+      <w:r>
+        <w:drawing>
+          <wp:inline xmlns:a="http://schemas.openxmlformats.org/drawingml/2006/main" xmlns:pic="http://schemas.openxmlformats.org/drawingml/2006/picture">
+            <wp:extent cx="5029200" cy="1799439"/>
+            <wp:docPr id="18" name="Picture 18"/>
+            <wp:cNvGraphicFramePr>
+              <a:graphicFrameLocks noChangeAspect="1"/>
+            </wp:cNvGraphicFramePr>
+            <a:graphic>
+              <a:graphicData uri="http://schemas.openxmlformats.org/drawingml/2006/picture">
+                <pic:pic>
+                  <pic:nvPicPr>
+                    <pic:cNvPr id="0" name="1_5_nist_timeline.png"/>
+                    <pic:cNvPicPr/>
+                  </pic:nvPicPr>
+                  <pic:blipFill>
+                    <a:blip r:embed="rId22"/>
+                    <a:stretch>
+                      <a:fillRect/>
+                    </a:stretch>
+                  </pic:blipFill>
+                  <pic:spPr>
+                    <a:xfrm>
+                      <a:off x="0" y="0"/>
+                      <a:ext cx="5029200" cy="1799439"/>
+                    </a:xfrm>
+                    <a:prstGeom prst="rect"/>
+                  </pic:spPr>
+                </pic:pic>
+              </a:graphicData>
+            </a:graphic>
+          </wp:inline>
+        </w:drawing>
+      </w:r>
+    </w:p>
+    <w:p>
+      <w:pPr>
+        <w:jc w:val="center"/>
+      </w:pPr>
+      <w:r>
+        <w:rPr>
+          <w:i/>
+          <w:sz w:val="20"/>
+        </w:rPr>
+        <w:t>1.5-rasm: NIST yengil vaznli kriptografiya standartlashtirish jarayoni</w:t>
+      </w:r>
+    </w:p>
+    <w:p>
+      <w:pPr>
         <w:pStyle w:val="4"/>
         <w:spacing w:before="0" w:line="360" w:lineRule="auto"/>
         <w:ind w:firstLine="708"/>
@@ -34524,6 +34881,444 @@
         <w:t>main.py - buyruq satrli interfeys.</w:t>
       </w:r>
     </w:p>
+    <w:p>
+      <w:pPr>
+        <w:jc w:val="center"/>
+      </w:pPr>
+      <w:r>
+        <w:rPr>
+          <w:b/>
+          <w:sz w:val="22"/>
+        </w:rPr>
+        <w:t>2.3-jadval</w:t>
+      </w:r>
+      <w:r>
+        <w:rPr>
+          <w:i/>
+          <w:sz w:val="20"/>
+        </w:rPr>
+        <w:br/>
+        <w:t>Dastur modullarining tuzilishi va vazifalari</w:t>
+      </w:r>
+    </w:p>
+    <w:tbl>
+      <w:tblPr>
+        <w:tblW w:type="auto" w:w="0"/>
+        <w:tblLook w:firstColumn="1" w:firstRow="1" w:lastColumn="0" w:lastRow="0" w:noHBand="0" w:noVBand="1" w:val="04A0"/>
+        <w:tblBorders>
+          <w:top w:val="single" w:sz="4" w:space="0" w:color="000000"/>
+          <w:left w:val="single" w:sz="4" w:space="0" w:color="000000"/>
+          <w:bottom w:val="single" w:sz="4" w:space="0" w:color="000000"/>
+          <w:right w:val="single" w:sz="4" w:space="0" w:color="000000"/>
+          <w:insideH w:val="single" w:sz="4" w:space="0" w:color="000000"/>
+          <w:insideV w:val="single" w:sz="4" w:space="0" w:color="000000"/>
+        </w:tblBorders>
+      </w:tblPr>
+      <w:tblGrid>
+        <w:gridCol w:w="3118"/>
+        <w:gridCol w:w="3118"/>
+        <w:gridCol w:w="3118"/>
+      </w:tblGrid>
+      <w:tr>
+        <w:tc>
+          <w:tcPr>
+            <w:tcW w:type="dxa" w:w="3118"/>
+          </w:tcPr>
+          <w:p>
+            <w:r/>
+            <w:r>
+              <w:rPr>
+                <w:b/>
+                <w:sz w:val="18"/>
+              </w:rPr>
+              <w:t>Modul / Fayl</w:t>
+            </w:r>
+          </w:p>
+        </w:tc>
+        <w:tc>
+          <w:tcPr>
+            <w:tcW w:type="dxa" w:w="3118"/>
+          </w:tcPr>
+          <w:p>
+            <w:r/>
+            <w:r>
+              <w:rPr>
+                <w:b/>
+                <w:sz w:val="18"/>
+              </w:rPr>
+              <w:t>Vazifasi</w:t>
+            </w:r>
+          </w:p>
+        </w:tc>
+        <w:tc>
+          <w:tcPr>
+            <w:tcW w:type="dxa" w:w="3118"/>
+          </w:tcPr>
+          <w:p>
+            <w:r/>
+            <w:r>
+              <w:rPr>
+                <w:b/>
+                <w:sz w:val="18"/>
+              </w:rPr>
+              <w:t>Asosiy funksiyalar</w:t>
+            </w:r>
+          </w:p>
+        </w:tc>
+      </w:tr>
+      <w:tr>
+        <w:tc>
+          <w:tcPr>
+            <w:tcW w:type="dxa" w:w="3118"/>
+          </w:tcPr>
+          <w:p>
+            <w:r/>
+            <w:r>
+              <w:rPr>
+                <w:sz w:val="18"/>
+              </w:rPr>
+              <w:t>hashes/ascon_hash.py</w:t>
+            </w:r>
+          </w:p>
+        </w:tc>
+        <w:tc>
+          <w:tcPr>
+            <w:tcW w:type="dxa" w:w="3118"/>
+          </w:tcPr>
+          <w:p>
+            <w:r/>
+            <w:r>
+              <w:rPr>
+                <w:sz w:val="18"/>
+              </w:rPr>
+              <w:t>Ascon-Hash256 implementatsiyasi</w:t>
+            </w:r>
+          </w:p>
+        </w:tc>
+        <w:tc>
+          <w:tcPr>
+            <w:tcW w:type="dxa" w:w="3118"/>
+          </w:tcPr>
+          <w:p>
+            <w:r/>
+            <w:r>
+              <w:rPr>
+                <w:sz w:val="18"/>
+              </w:rPr>
+              <w:t>Sponge, 12-raundli permutatsiya</w:t>
+            </w:r>
+          </w:p>
+        </w:tc>
+      </w:tr>
+      <w:tr>
+        <w:tc>
+          <w:tcPr>
+            <w:tcW w:type="dxa" w:w="3118"/>
+          </w:tcPr>
+          <w:p>
+            <w:r/>
+            <w:r>
+              <w:rPr>
+                <w:sz w:val="18"/>
+              </w:rPr>
+              <w:t>hashes/photon.py</w:t>
+            </w:r>
+          </w:p>
+        </w:tc>
+        <w:tc>
+          <w:tcPr>
+            <w:tcW w:type="dxa" w:w="3118"/>
+          </w:tcPr>
+          <w:p>
+            <w:r/>
+            <w:r>
+              <w:rPr>
+                <w:sz w:val="18"/>
+              </w:rPr>
+              <w:t>PHOTON-Beetle-Hash</w:t>
+            </w:r>
+          </w:p>
+        </w:tc>
+        <w:tc>
+          <w:tcPr>
+            <w:tcW w:type="dxa" w:w="3118"/>
+          </w:tcPr>
+          <w:p>
+            <w:r/>
+            <w:r>
+              <w:rPr>
+                <w:sz w:val="18"/>
+              </w:rPr>
+              <w:t>AES-o'xshash MDS matritsa, 12 raund</w:t>
+            </w:r>
+          </w:p>
+        </w:tc>
+      </w:tr>
+      <w:tr>
+        <w:tc>
+          <w:tcPr>
+            <w:tcW w:type="dxa" w:w="3118"/>
+          </w:tcPr>
+          <w:p>
+            <w:r/>
+            <w:r>
+              <w:rPr>
+                <w:sz w:val="18"/>
+              </w:rPr>
+              <w:t>hashes/spongent.py</w:t>
+            </w:r>
+          </w:p>
+        </w:tc>
+        <w:tc>
+          <w:tcPr>
+            <w:tcW w:type="dxa" w:w="3118"/>
+          </w:tcPr>
+          <w:p>
+            <w:r/>
+            <w:r>
+              <w:rPr>
+                <w:sz w:val="18"/>
+              </w:rPr>
+              <w:t>SPONGENT-128 implementatsiyasi</w:t>
+            </w:r>
+          </w:p>
+        </w:tc>
+        <w:tc>
+          <w:tcPr>
+            <w:tcW w:type="dxa" w:w="3118"/>
+          </w:tcPr>
+          <w:p>
+            <w:r/>
+            <w:r>
+              <w:rPr>
+                <w:sz w:val="18"/>
+              </w:rPr>
+              <w:t>PRESENT S-box, bit-permutatsiya, 70 raund</w:t>
+            </w:r>
+          </w:p>
+        </w:tc>
+      </w:tr>
+      <w:tr>
+        <w:tc>
+          <w:tcPr>
+            <w:tcW w:type="dxa" w:w="3118"/>
+          </w:tcPr>
+          <w:p>
+            <w:r/>
+            <w:r>
+              <w:rPr>
+                <w:sz w:val="18"/>
+              </w:rPr>
+              <w:t>hashes/reference.py</w:t>
+            </w:r>
+          </w:p>
+        </w:tc>
+        <w:tc>
+          <w:tcPr>
+            <w:tcW w:type="dxa" w:w="3118"/>
+          </w:tcPr>
+          <w:p>
+            <w:r/>
+            <w:r>
+              <w:rPr>
+                <w:sz w:val="18"/>
+              </w:rPr>
+              <w:t>SHA-256, SHA-3, BLAKE2s</w:t>
+            </w:r>
+          </w:p>
+        </w:tc>
+        <w:tc>
+          <w:tcPr>
+            <w:tcW w:type="dxa" w:w="3118"/>
+          </w:tcPr>
+          <w:p>
+            <w:r/>
+            <w:r>
+              <w:rPr>
+                <w:sz w:val="18"/>
+              </w:rPr>
+              <w:t>Standart taqqoslash uchun (hashlib)</w:t>
+            </w:r>
+          </w:p>
+        </w:tc>
+      </w:tr>
+      <w:tr>
+        <w:tc>
+          <w:tcPr>
+            <w:tcW w:type="dxa" w:w="3118"/>
+          </w:tcPr>
+          <w:p>
+            <w:r/>
+            <w:r>
+              <w:rPr>
+                <w:sz w:val="18"/>
+              </w:rPr>
+              <w:t>analysis/avalanche.py</w:t>
+            </w:r>
+          </w:p>
+        </w:tc>
+        <w:tc>
+          <w:tcPr>
+            <w:tcW w:type="dxa" w:w="3118"/>
+          </w:tcPr>
+          <w:p>
+            <w:r/>
+            <w:r>
+              <w:rPr>
+                <w:sz w:val="18"/>
+              </w:rPr>
+              <w:t>Avalanche effekti tahlili</w:t>
+            </w:r>
+          </w:p>
+        </w:tc>
+        <w:tc>
+          <w:tcPr>
+            <w:tcW w:type="dxa" w:w="3118"/>
+          </w:tcPr>
+          <w:p>
+            <w:r/>
+            <w:r>
+              <w:rPr>
+                <w:sz w:val="18"/>
+              </w:rPr>
+              <w:t>Hamming masofasi, SAC tekshiruvi</w:t>
+            </w:r>
+          </w:p>
+        </w:tc>
+      </w:tr>
+      <w:tr>
+        <w:tc>
+          <w:tcPr>
+            <w:tcW w:type="dxa" w:w="3118"/>
+          </w:tcPr>
+          <w:p>
+            <w:r/>
+            <w:r>
+              <w:rPr>
+                <w:sz w:val="18"/>
+              </w:rPr>
+              <w:t>analysis/performance.py</w:t>
+            </w:r>
+          </w:p>
+        </w:tc>
+        <w:tc>
+          <w:tcPr>
+            <w:tcW w:type="dxa" w:w="3118"/>
+          </w:tcPr>
+          <w:p>
+            <w:r/>
+            <w:r>
+              <w:rPr>
+                <w:sz w:val="18"/>
+              </w:rPr>
+              <w:t>Unumdorlik o'lchash</w:t>
+            </w:r>
+          </w:p>
+        </w:tc>
+        <w:tc>
+          <w:tcPr>
+            <w:tcW w:type="dxa" w:w="3118"/>
+          </w:tcPr>
+          <w:p>
+            <w:r/>
+            <w:r>
+              <w:rPr>
+                <w:sz w:val="18"/>
+              </w:rPr>
+              <w:t>MB/s, vaqt budjeti asosida</w:t>
+            </w:r>
+          </w:p>
+        </w:tc>
+      </w:tr>
+      <w:tr>
+        <w:tc>
+          <w:tcPr>
+            <w:tcW w:type="dxa" w:w="3118"/>
+          </w:tcPr>
+          <w:p>
+            <w:r/>
+            <w:r>
+              <w:rPr>
+                <w:sz w:val="18"/>
+              </w:rPr>
+              <w:t>analysis/resources.py</w:t>
+            </w:r>
+          </w:p>
+        </w:tc>
+        <w:tc>
+          <w:tcPr>
+            <w:tcW w:type="dxa" w:w="3118"/>
+          </w:tcPr>
+          <w:p>
+            <w:r/>
+            <w:r>
+              <w:rPr>
+                <w:sz w:val="18"/>
+              </w:rPr>
+              <w:t>Resurs tahlili</w:t>
+            </w:r>
+          </w:p>
+        </w:tc>
+        <w:tc>
+          <w:tcPr>
+            <w:tcW w:type="dxa" w:w="3118"/>
+          </w:tcPr>
+          <w:p>
+            <w:r/>
+            <w:r>
+              <w:rPr>
+                <w:sz w:val="18"/>
+              </w:rPr>
+              <w:t>GE, holat hajmi, apparat ko'rsatkichlari</w:t>
+            </w:r>
+          </w:p>
+        </w:tc>
+      </w:tr>
+      <w:tr>
+        <w:tc>
+          <w:tcPr>
+            <w:tcW w:type="dxa" w:w="3118"/>
+          </w:tcPr>
+          <w:p>
+            <w:r/>
+            <w:r>
+              <w:rPr>
+                <w:sz w:val="18"/>
+              </w:rPr>
+              <w:t>analysis/report.py</w:t>
+            </w:r>
+          </w:p>
+        </w:tc>
+        <w:tc>
+          <w:tcPr>
+            <w:tcW w:type="dxa" w:w="3118"/>
+          </w:tcPr>
+          <w:p>
+            <w:r/>
+            <w:r>
+              <w:rPr>
+                <w:sz w:val="18"/>
+              </w:rPr>
+              <w:t>PDF hisobot generatsiyasi</w:t>
+            </w:r>
+          </w:p>
+        </w:tc>
+        <w:tc>
+          <w:tcPr>
+            <w:tcW w:type="dxa" w:w="3118"/>
+          </w:tcPr>
+          <w:p>
+            <w:r/>
+            <w:r>
+              <w:rPr>
+                <w:sz w:val="18"/>
+              </w:rPr>
+              <w:t>Jadval va grafiklar bilan hisobot</w:t>
+            </w:r>
+          </w:p>
+        </w:tc>
+      </w:tr>
+    </w:tbl>
     <w:p>
       <w:pPr>
         <w:spacing w:after="0" w:line="360" w:lineRule="auto"/>
@@ -35930,7 +36725,7 @@
           <w:szCs w:val="28"/>
           <w:lang w:val="en-US"/>
         </w:rPr>
-        <w:t>Yaxshi kriptografik xesh funksiyada kirishning bitta biti o'zgarsa, chiqishning taxminan yarmi (50%) o'zgarishi kerak. Bu xususiyat "Strict Avalanche Criterion" (SAC) deb ataladi va funksiyaning diffuziya sifatini o'lchaydi. Dasturimizda avalanche effektini tahlil qilish quyidagi metodologiya asosida amalga oshirilgan(2.5-rasim)</w:t>
+        <w:t>Yaxshi kriptografik xesh funksiyada kirishning bitta biti o'zgarsa, chiqishning taxminan yarmi (50%) o'zgarishi kerak. Bu xususiyat "Strict Avalanche Criterion" (SAC) deb ataladi va funksiyaning diffuziya sifatini o'lchaydi. Dasturimizda avalanche effektini tahlil qilish quyidagi metodologiya asosida amalga oshirilgan(2.5-rasm)</w:t>
       </w:r>
     </w:p>
     <w:p>
@@ -42736,7 +43531,7 @@
           <w:szCs w:val="28"/>
           <w:lang w:val="en-US"/>
         </w:rPr>
-        <w:t>2.7-rasim: Xesh funksiyalarining resurslar solishtirmasi</w:t>
+        <w:t>2.7-rasm: Xesh funksiyalarining resurslar solishtirmasi</w:t>
       </w:r>
     </w:p>
     <w:p>
@@ -44026,6 +44821,57 @@
     </w:p>
     <w:p>
       <w:pPr>
+        <w:jc w:val="center"/>
+      </w:pPr>
+      <w:r>
+        <w:drawing>
+          <wp:inline xmlns:a="http://schemas.openxmlformats.org/drawingml/2006/main" xmlns:pic="http://schemas.openxmlformats.org/drawingml/2006/picture">
+            <wp:extent cx="5029200" cy="5083172"/>
+            <wp:docPr id="21" name="Picture 21"/>
+            <wp:cNvGraphicFramePr>
+              <a:graphicFrameLocks noChangeAspect="1"/>
+            </wp:cNvGraphicFramePr>
+            <a:graphic>
+              <a:graphicData uri="http://schemas.openxmlformats.org/drawingml/2006/picture">
+                <pic:pic>
+                  <pic:nvPicPr>
+                    <pic:cNvPr id="0" name="radar_chart.png"/>
+                    <pic:cNvPicPr/>
+                  </pic:nvPicPr>
+                  <pic:blipFill>
+                    <a:blip r:embed="rId25"/>
+                    <a:stretch>
+                      <a:fillRect/>
+                    </a:stretch>
+                  </pic:blipFill>
+                  <pic:spPr>
+                    <a:xfrm>
+                      <a:off x="0" y="0"/>
+                      <a:ext cx="5029200" cy="5083172"/>
+                    </a:xfrm>
+                    <a:prstGeom prst="rect"/>
+                  </pic:spPr>
+                </pic:pic>
+              </a:graphicData>
+            </a:graphic>
+          </wp:inline>
+        </w:drawing>
+      </w:r>
+    </w:p>
+    <w:p>
+      <w:pPr>
+        <w:jc w:val="center"/>
+      </w:pPr>
+      <w:r>
+        <w:rPr>
+          <w:i/>
+          <w:sz w:val="20"/>
+        </w:rPr>
+        <w:t>2.9-rasm: Yengil vaznli xesh funksiyalarning ko'p mezonli solishtirmasi (radar diagramma)</w:t>
+      </w:r>
+    </w:p>
+    <w:p>
+      <w:pPr>
         <w:spacing w:after="0" w:line="360" w:lineRule="auto"/>
         <w:ind w:firstLine="708"/>
         <w:jc w:val="center"/>
@@ -44109,7 +44955,7 @@
           <w:szCs w:val="28"/>
           <w:lang w:val="en-US"/>
         </w:rPr>
-        <w:t>2.8-rasim: Xesh funksiyalarining solishtirmasining yakuniy qismi</w:t>
+        <w:t>2.8-rasm: Xesh funksiyalarining solishtirmasining yakuniy qismi</w:t>
       </w:r>
     </w:p>
     <w:p>

</xml_diff>